<commit_message>
Update Tenorshare manual with Mac Keychain recovery
</commit_message>
<xml_diff>
--- a/docs/Tenorshare CMS 文章助手同事试用指南.docx
+++ b/docs/Tenorshare CMS 文章助手同事试用指南.docx
@@ -75,12 +75,30 @@
         <w:keepLines/>
       </w:pPr>
       <w:r>
-        <w:t>请安装或更新 Tenorshare CMS 文章助手，仓库是 https://github.com/Albzh99/tenorshare-cms-assistant-marketplace 。请按仓库 SETUP.md 自动识别我的 Windows 或 macOS，自己执行安装和检查。先检查本机是否已有可用 CMS Key；有就不要再问。没有时，请打开可见终端并启动剪贴板保存流程，让我复制 Key 后回到同一个终端按 Enter。保存后运行 verify-workstation.py，实际检查 Key、CMS POST 和 WebP 能力。不要让我输入命令，不要让我把 Key 发在聊天里。安装完成后请问我负责的网站、语言和文章类型，并告诉我下一句该发什么。</w:t>
+        <w:t>请安装或更新 Tenorshare CMS 文章助手，仓库是 https://github.com/Albzh99/tenorshare-cms-assistant-marketplace 。请按仓库 SETUP.md 自动识别 Windows 或 macOS，自己安装并检查。先检查本机是否已有 CMS Key，有就不要再问。只有确实没有时才启动剪贴板保存：Mac 必须由 AI 打开独立的系统 Terminal.app，不能用 Codex 内置终端。我只复制 Key，回到系统终端按 Enter，不会手输命令或把 Key 发在聊天。保存后运行 verify-workstation.py 检查 Key、只读 CMS POST 与 WebP 能力。若 Mac 的 Keychain 返回 status=-50，请按 SETUP.md 诊断，不要说我未填 Key 或要求重存。安装完成后提醒我首次建规范用较强模型，只问网站和语言；不要预先问文章分类或版式类型。</w:t>
       </w:r>
     </w:p>
     <w:p>
       <w:r>
-        <w:t>如果需要 Key：只有在你真的看到终端显示“请现在复制完整的 CMS API Key”时，才复制管理员给的 Key；回到那个终端按一次 Enter，不用粘贴。若 AI 说终端已打开但你看不到，就让它打开同一个运行会话，先不要复制 Key。已经保存过且检查通过的人跳过此步骤。</w:t>
+        <w:t>如果需要 Key：只有你确实看到独立系统 Terminal.app 显示“请现在复制完整的 CMS API Key”，才复制 Key；回到该窗口按一次 Enter，不用粘贴。若窗口显示“已保存并验证”，就不要重复输入。AI 应用同一新版插件检查凭据与只读 CMS 请求。</w:t>
+      </w:r>
+    </w:p>
+    <w:p>
+      <w:pPr>
+        <w:pStyle w:val="Heading2"/>
+      </w:pPr>
+      <w:r>
+        <w:t>Mac 显示已保存但 Codex 找不到 Key</w:t>
+      </w:r>
+    </w:p>
+    <w:p>
+      <w:r>
+        <w:t>这是保存后读取失败，不表示 Key 没填或没有 CMS 权限。先让 AI 更新 Tenorshare 插件并运行当前版本的 check-key；旧 Keychain 接口返回 status=-50 时，新版会尝试系统 security 读取同一用户的条目。随后只读测试 /cms/site/list。不要再次复制 Key，也不要把 Key 发到聊天。</w:t>
+      </w:r>
+    </w:p>
+    <w:p>
+      <w:r>
+        <w:t>可直接发给 AI：系统 Terminal 已显示 CMS Key 保存并验证成功。请更新 Tenorshare 助手，用当前插件执行 check-key 与只读 /cms/site/list。不要让我重填 Key。若仍失败，只报告脚本路径、Keychain 旧接口状态和 security 退出码；若已到 CMS，则报告脱敏的 HTTP 状态、code、msg、request_id。不要输出 Key。</w:t>
       </w:r>
     </w:p>
     <w:p>
@@ -93,7 +111,7 @@
     </w:p>
     <w:p>
       <w:r>
-        <w:t>首次为某个网站、语言和文章类型建规范，建议选较强的模型。AI 会读取该站点已经发布的同类文章，整理标题、目录、段落、图片、表格、下载区、使用指南、Buy Box、视频和本站其他模块的真实结构。它会标明哪些必有、可选、不存在或待确认，以及各自的出现条件和顺序；不会把 PoGoskill 的模块当作全站通用要求。旧 HTML 或参考 URL 可作为补充，但通常不需要你主动找。</w:t>
+        <w:t>首次为某个网站和语言建规范时，建议选较强的模型。AI 会读取本站同模板、同正文版式的已发布文章，可跨 CMS 分类取样；分类不同而 HTML 相同就共用一套规范。它会整理标题、目录、段落、图片、表格和本站实际存在的可选模块，并标明出现条件。旧 HTML 或参考 URL 可以作为补充，但不是必填。</w:t>
       </w:r>
     </w:p>
     <w:p>
@@ -113,12 +131,12 @@
         <w:keepLines/>
       </w:pPr>
       <w:r>
-        <w:t>我负责【网站网址或产品名】【语言】的【文章类型】。请使用 $tenorshare-cms-article-assistant，从 CMS 同站点已发布文章建立只供本站使用的 HTML 规范。逐项判断下载、使用指南、视频等模块在本站是否存在、何时出现；给我看简明审核报告、真实组件样本和待确认项。现在只建规范，不上传文章。</w:t>
+        <w:t>我负责【网站网址或产品名】【语言】的文章。请使用 $tenorshare-cms-article-assistant，从 CMS 本站同模板、同正文版式的已发布文章建立 HTML 规范；可跨分类取样，不要先问我分类或版式类型。逐项检查主图外层对齐容器、标题、目录、图片、表格、下载、视频及本站其他模块，给我简明审核报告、真实组件样本和待确认项。现在只建规范，不上传文章。</w:t>
       </w:r>
     </w:p>
     <w:p>
       <w:r>
-        <w:t>把方括号换成自己的信息，例如“4DDiG 西班牙语网站的 SEO 文章”。一个网站有多个语言或文章类型时，要分别建立规范。此阶段 AI 只能读取 CMS，不得新建、修改、删除、上传、生成或发布 CMS 内容。</w:t>
+        <w:t>把方括号换成网站和语言，例如“4DDiG 西班牙语网站”。只有真实模板或正文结构不同才建立另一个版式族；不同分类不自动拆规范。学习阶段 CMS 只读，不新建、修改、删除、上传、生成或发布内容。</w:t>
       </w:r>
     </w:p>
     <w:p>
@@ -149,7 +167,7 @@
     </w:p>
     <w:p>
       <w:r>
-        <w:t>每篇文章只放一个网站、一种语言、一篇完整正文；网站、语言、文章类型在发给 AI 的消息中说明。DOCX 开头的 Meta 只放下面六项，不混入作者、分类、产品或图片字段。已有 Meta 请逐字填写；缺少的字段可留“待 AI 按本站规范核对”。</w:t>
+        <w:t>每篇文章只放一个网站、一种语言、一篇完整正文；在消息中说明网站和语言，不用自己判断文章分类或版式类型。DOCX 开头的 Meta 只放下面六项，不混入作者、分类、产品或图片字段。已有 Meta 请逐字填写；缺少的字段可留“待 AI 按本站规范核对”。</w:t>
       </w:r>
     </w:p>
     <w:p>
@@ -227,7 +245,7 @@
         <w:keepLines/>
       </w:pPr>
       <w:r>
-        <w:t>我负责【网站网址或产品名】【语言】的【文章类型】。这是新文章。请使用 $tenorshare-cms-article-assistant，只按本机已确认的本站 HTML 规范，完整保留我给的文字和图片，处理图片后通过 CMS API 保存为草稿并回读核对。不要重新学习其他文章，不要生成或发布文章。</w:t>
+        <w:t>我负责【网站网址或产品名】【语言】的文章。这是新文章。请使用 $tenorshare-cms-article-assistant，只按本机已确认的本站 HTML 规范完整保留文字和图片；主图保留本站真实外层容器与对齐方式。按主题和 URL 实时选择 CMS 分类，处理图片后保存为草稿并回读核对。不要重新学习其他文章，不要生成或发布文章。</w:t>
       </w:r>
     </w:p>
     <w:p>

</xml_diff>